<commit_message>
Make Preferences prominent and start at login by default
- Gear-icon Preferences button, filled in the brand colour; the EN/VI
  switch moves to the top of the window
- Start at login is on by default (registered on first launch); the
  window still shows at startup and the default duration stays
  indefinite
- Explain "Turn on when Rosavin starts" with a hint in both languages
- Refresh screenshots and user guides
</commit_message>
<xml_diff>
--- a/docs/USER_GUIDE.en.docx
+++ b/docs/USER_GUIDE.en.docx
@@ -2407,7 +2407,39 @@
         <w:t xml:space="preserve"> </w:t>
       </w:r>
       <w:r>
-        <w:t xml:space="preserve">option, the</w:t>
+        <w:t xml:space="preserve">option, the green</w:t>
+      </w:r>
+      <w:r>
+        <w:t xml:space="preserve"> </w:t>
+      </w:r>
+      <w:r>
+        <w:rPr>
+          <w:b/>
+          <w:bCs/>
+        </w:rPr>
+        <w:t xml:space="preserve">⚙ Preferences</w:t>
+      </w:r>
+      <w:r>
+        <w:t xml:space="preserve"> </w:t>
+      </w:r>
+      <w:r>
+        <w:t xml:space="preserve">button and</w:t>
+      </w:r>
+      <w:r>
+        <w:t xml:space="preserve"> </w:t>
+      </w:r>
+      <w:r>
+        <w:rPr>
+          <w:b/>
+          <w:bCs/>
+        </w:rPr>
+        <w:t xml:space="preserve">About</w:t>
+      </w:r>
+      <w:r>
+        <w:t xml:space="preserve"> </w:t>
+      </w:r>
+      <w:r>
+        <w:t xml:space="preserve">(i). The</w:t>
       </w:r>
       <w:r>
         <w:t xml:space="preserve"> </w:t>
@@ -2423,39 +2455,7 @@
         <w:t xml:space="preserve"> </w:t>
       </w:r>
       <w:r>
-        <w:t xml:space="preserve">language switch,</w:t>
-      </w:r>
-      <w:r>
-        <w:t xml:space="preserve"> </w:t>
-      </w:r>
-      <w:r>
-        <w:rPr>
-          <w:b/>
-          <w:bCs/>
-        </w:rPr>
-        <w:t xml:space="preserve">Preferences</w:t>
-      </w:r>
-      <w:r>
-        <w:t xml:space="preserve"> </w:t>
-      </w:r>
-      <w:r>
-        <w:t xml:space="preserve">(sliders) and</w:t>
-      </w:r>
-      <w:r>
-        <w:t xml:space="preserve"> </w:t>
-      </w:r>
-      <w:r>
-        <w:rPr>
-          <w:b/>
-          <w:bCs/>
-        </w:rPr>
-        <w:t xml:space="preserve">About</w:t>
-      </w:r>
-      <w:r>
-        <w:t xml:space="preserve"> </w:t>
-      </w:r>
-      <w:r>
-        <w:t xml:space="preserve">(i).</w:t>
+        <w:t xml:space="preserve">language switch sits at the top right.</w:t>
       </w:r>
     </w:p>
     <w:p>
@@ -3627,7 +3627,23 @@
         <w:pStyle w:val="FirstParagraph"/>
       </w:pPr>
       <w:r>
-        <w:t xml:space="preserve">Open Preferences with the sliders button in the window,</w:t>
+        <w:t xml:space="preserve">Open Preferences with the green</w:t>
+      </w:r>
+      <w:r>
+        <w:t xml:space="preserve"> </w:t>
+      </w:r>
+      <w:r>
+        <w:rPr>
+          <w:b/>
+          <w:bCs/>
+        </w:rPr>
+        <w:t xml:space="preserve">⚙ Preferences</w:t>
+      </w:r>
+      <w:r>
+        <w:t xml:space="preserve"> </w:t>
+      </w:r>
+      <w:r>
+        <w:t xml:space="preserve">button at the bottom of the window,</w:t>
       </w:r>
       <w:r>
         <w:t xml:space="preserve"> </w:t>
@@ -3778,7 +3794,7 @@
               <w:pStyle w:val="Compact"/>
             </w:pPr>
             <w:r>
-              <w:t xml:space="preserve">Rosavin starts automatically (quietly, in the menu bar) when you log in. On macOS you may need to allow it in</w:t>
+              <w:t xml:space="preserve">On by default. Rosavin starts automatically (quietly, in the menu bar) when you log in. On macOS you may need to allow it in</w:t>
             </w:r>
             <w:r>
               <w:t xml:space="preserve"> </w:t>
@@ -3816,7 +3832,23 @@
               <w:pStyle w:val="Compact"/>
             </w:pPr>
             <w:r>
-              <w:t xml:space="preserve">Rosavin switches itself on every time it starts, using the default duration</w:t>
+              <w:t xml:space="preserve">Off by default. When on, Rosavin keeps your computer awake as soon as it opens, using the default duration. Combine it with</w:t>
+            </w:r>
+            <w:r>
+              <w:t xml:space="preserve"> </w:t>
+            </w:r>
+            <w:r>
+              <w:rPr>
+                <w:i/>
+                <w:iCs/>
+              </w:rPr>
+              <w:t xml:space="preserve">Start Rosavin at login</w:t>
+            </w:r>
+            <w:r>
+              <w:t xml:space="preserve"> </w:t>
+            </w:r>
+            <w:r>
+              <w:t xml:space="preserve">to stay awake from the moment you sign in</w:t>
             </w:r>
           </w:p>
         </w:tc>
@@ -3844,7 +3876,7 @@
               <w:pStyle w:val="Compact"/>
             </w:pPr>
             <w:r>
-              <w:t xml:space="preserve">Open the window when Rosavin starts (same as the checkbox at the bottom of the window)</w:t>
+              <w:t xml:space="preserve">On by default. Open the window when you start Rosavin (same as the checkbox at the bottom of the window)</w:t>
             </w:r>
           </w:p>
         </w:tc>
@@ -3901,7 +3933,7 @@
               <w:t xml:space="preserve"> </w:t>
             </w:r>
             <w:r>
-              <w:t xml:space="preserve">or a time from 5 minutes to 8 hours</w:t>
+              <w:t xml:space="preserve">(default) or a time from 5 minutes to 8 hours</w:t>
             </w:r>
           </w:p>
         </w:tc>
@@ -4100,7 +4132,7 @@
               <w:t xml:space="preserve"> </w:t>
             </w:r>
             <w:r>
-              <w:t xml:space="preserve">switch in the window</w:t>
+              <w:t xml:space="preserve">switch at the top right of the window</w:t>
             </w:r>
           </w:p>
         </w:tc>

</xml_diff>

<commit_message>
Replace the eye with a golden sunflower
The eye symbol made some people feel watched, so Rosavin's symbol is
now a sunflower, which follows the sun all day:

- New logo, app icon, DMG artwork and Windows tray badges
- Menu bar icon: filled, seeded sunflower when on, outline when off
- Main window: a folded grey sunflower that blooms in gold when
  Rosavin turns on; sunflower and moon icons replace the eye icons
- scripts/make-sunflower.mjs generates all sunflower artwork
- Updated wording, screenshots and user guides in both languages
</commit_message>
<xml_diff>
--- a/docs/USER_GUIDE.en.docx
+++ b/docs/USER_GUIDE.en.docx
@@ -9,7 +9,7 @@
       <w:r>
         <w:drawing>
           <wp:inline>
-            <wp:extent cx="2565654" cy="632861"/>
+            <wp:extent cx="2565654" cy="675622"/>
             <wp:effectExtent b="0" l="0" r="0" t="0"/>
             <wp:docPr descr="Rosavin" title="" id="10" name="Picture"/>
             <a:graphic>
@@ -30,7 +30,7 @@
                   <pic:spPr bwMode="auto">
                     <a:xfrm>
                       <a:off x="0" y="0"/>
-                      <a:ext cx="2565654" cy="632861"/>
+                      <a:ext cx="2565654" cy="675622"/>
                     </a:xfrm>
                     <a:prstGeom prst="rect">
                       <a:avLst/>
@@ -1159,7 +1159,7 @@
         <w:t xml:space="preserve"> </w:t>
       </w:r>
       <w:r>
-        <w:t xml:space="preserve">arrow to show hidden icons, then drag the eye icon onto the taskbar to keep it visible.</w:t>
+        <w:t xml:space="preserve">arrow to show hidden icons, then drag the sunflower icon onto the taskbar to keep it visible.</w:t>
       </w:r>
     </w:p>
     <w:bookmarkEnd w:id="19"/>
@@ -1178,17 +1178,17 @@
         <w:pStyle w:val="FirstParagraph"/>
       </w:pPr>
       <w:r>
-        <w:t xml:space="preserve">When Rosavin starts for the first time, its window opens and an</w:t>
-      </w:r>
-      <w:r>
-        <w:t xml:space="preserve"> </w:t>
-      </w:r>
-      <w:r>
-        <w:rPr>
-          <w:b/>
-          <w:bCs/>
-        </w:rPr>
-        <w:t xml:space="preserve">eye icon</w:t>
+        <w:t xml:space="preserve">When Rosavin starts for the first time, its window opens and a</w:t>
+      </w:r>
+      <w:r>
+        <w:t xml:space="preserve"> </w:t>
+      </w:r>
+      <w:r>
+        <w:rPr>
+          <w:b/>
+          <w:bCs/>
+        </w:rPr>
+        <w:t xml:space="preserve">sunflower icon</w:t>
       </w:r>
       <w:r>
         <w:t xml:space="preserve"> </w:t>
@@ -1271,13 +1271,13 @@
           <w:b/>
           <w:bCs/>
         </w:rPr>
-        <w:t xml:space="preserve">closed eye</w:t>
-      </w:r>
-      <w:r>
-        <w:t xml:space="preserve"> </w:t>
-      </w:r>
-      <w:r>
-        <w:t xml:space="preserve">in the window. It opens, glows gold, and Rosavin says</w:t>
+        <w:t xml:space="preserve">grey sunflower</w:t>
+      </w:r>
+      <w:r>
+        <w:t xml:space="preserve"> </w:t>
+      </w:r>
+      <w:r>
+        <w:t xml:space="preserve">in the window. It blooms in gold, and Rosavin says</w:t>
       </w:r>
       <w:r>
         <w:t xml:space="preserve"> </w:t>
@@ -1302,7 +1302,7 @@
         </w:numPr>
       </w:pPr>
       <w:r>
-        <w:t xml:space="preserve">Click it again to switch Rosavin off. The eye closes and your computer sleeps normally again.</w:t>
+        <w:t xml:space="preserve">Click it again to switch Rosavin off. The sunflower folds its petals and your computer sleeps normally again.</w:t>
       </w:r>
     </w:p>
     <w:p>
@@ -1369,7 +1369,7 @@
         <w:pStyle w:val="FirstParagraph"/>
       </w:pPr>
       <w:r>
-        <w:t xml:space="preserve">The eye icon shows Rosavin’s state at a glance:</w:t>
+        <w:t xml:space="preserve">The sunflower icon shows Rosavin’s state at a glance:</w:t>
       </w:r>
     </w:p>
     <w:p>
@@ -1381,7 +1381,7 @@
           <wp:inline>
             <wp:extent cx="4764786" cy="1227075"/>
             <wp:effectExtent b="0" l="0" r="0" t="0"/>
-            <wp:docPr descr="The menu bar icon when Rosavin is off (closed eye) and on (open eye with countdown), in light and dark menu bars" title="" id="26" name="Picture"/>
+            <wp:docPr descr="The menu bar icon when Rosavin is off (outline sunflower) and on (filled sunflower with countdown), in light and dark menu bars" title="" id="26" name="Picture"/>
             <a:graphic>
               <a:graphicData uri="http://schemas.openxmlformats.org/drawingml/2006/picture">
                 <pic:pic>
@@ -1424,13 +1424,14 @@
         <w:pStyle w:val="ImageCaption"/>
       </w:pPr>
       <w:r>
-        <w:t xml:space="preserve">The menu bar icon when Rosavin is off (closed eye) and on (open eye with countdown), in light and dark menu bars</w:t>
+        <w:t xml:space="preserve">The menu bar icon when Rosavin is off (outline sunflower) and on (filled sunflower with countdown), in light and dark menu bars</w:t>
       </w:r>
     </w:p>
     <w:tbl>
       <w:tblPr>
         <w:tblStyle w:val="Table"/>
-        <w:tblW w:type="auto" w:w="0"/>
+        <w:tblW w:type="pct" w:w="5000"/>
+        <w:tblLayout w:type="fixed"/>
         <w:tblLook w:firstRow="1" w:lastRow="0" w:firstColumn="0" w:lastColumn="0" w:noHBand="0" w:noVBand="0" w:val="0020"/>
       </w:tblPr>
       <w:tblGrid>
@@ -1476,13 +1477,7 @@
                 <w:b/>
                 <w:bCs/>
               </w:rPr>
-              <w:t xml:space="preserve">Closed eye</w:t>
-            </w:r>
-            <w:r>
-              <w:t xml:space="preserve"> </w:t>
-            </w:r>
-            <w:r>
-              <w:t xml:space="preserve">with lashes</w:t>
+              <w:t xml:space="preserve">Outline sunflower</w:t>
             </w:r>
           </w:p>
         </w:tc>
@@ -1510,13 +1505,13 @@
                 <w:b/>
                 <w:bCs/>
               </w:rPr>
-              <w:t xml:space="preserve">Open eye</w:t>
+              <w:t xml:space="preserve">Filled sunflower</w:t>
             </w:r>
             <w:r>
               <w:t xml:space="preserve"> </w:t>
             </w:r>
             <w:r>
-              <w:t xml:space="preserve">with three rays</w:t>
+              <w:t xml:space="preserve">(seeded centre)</w:t>
             </w:r>
           </w:p>
         </w:tc>
@@ -1544,7 +1539,7 @@
                 <w:b/>
                 <w:bCs/>
               </w:rPr>
-              <w:t xml:space="preserve">Open eye +</w:t>
+              <w:t xml:space="preserve">Filled sunflower +</w:t>
             </w:r>
             <w:r>
               <w:rPr>
@@ -2161,7 +2156,7 @@
           <w:b/>
           <w:bCs/>
         </w:rPr>
-        <w:t xml:space="preserve">The eye button.</w:t>
+        <w:t xml:space="preserve">The sunflower button.</w:t>
       </w:r>
       <w:r>
         <w:t xml:space="preserve"> </w:t>
@@ -4856,7 +4851,7 @@
           <w:b/>
           <w:bCs/>
         </w:rPr>
-        <w:t xml:space="preserve">I can’t see the eye icon in the menu bar.</w:t>
+        <w:t xml:space="preserve">I can’t see the sunflower icon in the menu bar.</w:t>
       </w:r>
       <w:r>
         <w:t xml:space="preserve"> </w:t>

</xml_diff>

<commit_message>
Explain sleeps that Rosavin cannot block
Rosavin holds a power assertion that stops automatic (idle) sleep, and the
power log shows it working. But a sleep the user asks for (Apple menu ›
Sleep, the power button), closing the lid or a nearly empty battery still
puts the Mac to sleep, which looked like Rosavin failing.

When the computer sleeps during a session, Rosavin now reads the reason
from `pmset -g log` after waking and shows a notification that says what
happened and suggests locking the screen with ⌃⌘Q instead. The README and
both user guides explain the difference. Version 1.0.1.
</commit_message>
<xml_diff>
--- a/docs/USER_GUIDE.en.docx
+++ b/docs/USER_GUIDE.en.docx
@@ -2910,6 +2910,82 @@
         <w:t xml:space="preserve">) or with the switch in the window. You can switch while Rosavin is on; the current session and timer continue.</w:t>
       </w:r>
     </w:p>
+    <w:p>
+      <w:pPr>
+        <w:pStyle w:val="BodyText"/>
+      </w:pPr>
+      <w:r>
+        <w:rPr>
+          <w:b/>
+          <w:bCs/>
+        </w:rPr>
+        <w:t xml:space="preserve">Stepping away?</w:t>
+      </w:r>
+      <w:r>
+        <w:t xml:space="preserve"> </w:t>
+      </w:r>
+      <w:r>
+        <w:t xml:space="preserve">Lock the screen with</w:t>
+      </w:r>
+      <w:r>
+        <w:t xml:space="preserve"> </w:t>
+      </w:r>
+      <w:r>
+        <w:rPr>
+          <w:b/>
+          <w:bCs/>
+        </w:rPr>
+        <w:t xml:space="preserve">⌃⌘Q</w:t>
+      </w:r>
+      <w:r>
+        <w:t xml:space="preserve"> </w:t>
+      </w:r>
+      <w:r>
+        <w:t xml:space="preserve">(Apple menu ›</w:t>
+      </w:r>
+      <w:r>
+        <w:t xml:space="preserve"> </w:t>
+      </w:r>
+      <w:r>
+        <w:rPr>
+          <w:b/>
+          <w:bCs/>
+        </w:rPr>
+        <w:t xml:space="preserve">Lock Screen</w:t>
+      </w:r>
+      <w:r>
+        <w:t xml:space="preserve">), or</w:t>
+      </w:r>
+      <w:r>
+        <w:t xml:space="preserve"> </w:t>
+      </w:r>
+      <w:r>
+        <w:rPr>
+          <w:b/>
+          <w:bCs/>
+        </w:rPr>
+        <w:t xml:space="preserve">Win+L</w:t>
+      </w:r>
+      <w:r>
+        <w:t xml:space="preserve"> </w:t>
+      </w:r>
+      <w:r>
+        <w:t xml:space="preserve">on Windows. Locking keeps everything running. Don’t choose</w:t>
+      </w:r>
+      <w:r>
+        <w:t xml:space="preserve"> </w:t>
+      </w:r>
+      <w:r>
+        <w:rPr>
+          <w:b/>
+          <w:bCs/>
+        </w:rPr>
+        <w:t xml:space="preserve">Sleep</w:t>
+      </w:r>
+      <w:r>
+        <w:t xml:space="preserve">: that puts the computer to sleep even while Rosavin is on.</w:t>
+      </w:r>
+    </w:p>
     <w:bookmarkEnd w:id="41"/>
     <w:bookmarkStart w:id="63" w:name="learn-about-rhodiola-rosea"/>
     <w:p>
@@ -4869,13 +4945,112 @@
           <w:b/>
           <w:bCs/>
         </w:rPr>
-        <w:t xml:space="preserve">My MacBook still sleeps when I close the lid.</w:t>
-      </w:r>
-      <w:r>
-        <w:t xml:space="preserve"> </w:t>
-      </w:r>
-      <w:r>
-        <w:t xml:space="preserve">That is a macOS rule for every app: a MacBook sleeps when its lid is closed unless it is connected to power and an external display. Keep the lid open, or use clamshell mode.</w:t>
+        <w:t xml:space="preserve">My Mac still went to sleep while Rosavin was on.</w:t>
+      </w:r>
+      <w:r>
+        <w:t xml:space="preserve"> </w:t>
+      </w:r>
+      <w:r>
+        <w:t xml:space="preserve">Rosavin stops</w:t>
+      </w:r>
+      <w:r>
+        <w:t xml:space="preserve"> </w:t>
+      </w:r>
+      <w:r>
+        <w:rPr>
+          <w:i/>
+          <w:iCs/>
+        </w:rPr>
+        <w:t xml:space="preserve">automatic</w:t>
+      </w:r>
+      <w:r>
+        <w:t xml:space="preserve"> </w:t>
+      </w:r>
+      <w:r>
+        <w:t xml:space="preserve">sleep, the kind that happens when you leave the computer alone. No app can override a sleep that is chosen or forced:</w:t>
+      </w:r>
+    </w:p>
+    <w:p>
+      <w:pPr>
+        <w:pStyle w:val="Compact"/>
+        <w:numPr>
+          <w:ilvl w:val="0"/>
+          <w:numId w:val="1011"/>
+        </w:numPr>
+      </w:pPr>
+      <w:r>
+        <w:rPr>
+          <w:b/>
+          <w:bCs/>
+        </w:rPr>
+        <w:t xml:space="preserve">Sleep</w:t>
+      </w:r>
+      <w:r>
+        <w:t xml:space="preserve"> </w:t>
+      </w:r>
+      <w:r>
+        <w:t xml:space="preserve">in the Apple menu, the power button, or a sleep shortcut;</w:t>
+      </w:r>
+    </w:p>
+    <w:p>
+      <w:pPr>
+        <w:pStyle w:val="Compact"/>
+        <w:numPr>
+          <w:ilvl w:val="0"/>
+          <w:numId w:val="1011"/>
+        </w:numPr>
+      </w:pPr>
+      <w:r>
+        <w:t xml:space="preserve">closing a MacBook lid, unless it is connected to power and an external display (clamshell mode);</w:t>
+      </w:r>
+    </w:p>
+    <w:p>
+      <w:pPr>
+        <w:pStyle w:val="Compact"/>
+        <w:numPr>
+          <w:ilvl w:val="0"/>
+          <w:numId w:val="1011"/>
+        </w:numPr>
+      </w:pPr>
+      <w:r>
+        <w:t xml:space="preserve">a nearly empty battery, or overheating.</w:t>
+      </w:r>
+    </w:p>
+    <w:p>
+      <w:pPr>
+        <w:pStyle w:val="FirstParagraph"/>
+      </w:pPr>
+      <w:r>
+        <w:t xml:space="preserve">To step away while tasks keep running, lock the screen with</w:t>
+      </w:r>
+      <w:r>
+        <w:t xml:space="preserve"> </w:t>
+      </w:r>
+      <w:r>
+        <w:rPr>
+          <w:b/>
+          <w:bCs/>
+        </w:rPr>
+        <w:t xml:space="preserve">⌃⌘Q</w:t>
+      </w:r>
+      <w:r>
+        <w:t xml:space="preserve"> </w:t>
+      </w:r>
+      <w:r>
+        <w:t xml:space="preserve">(Apple menu ›</w:t>
+      </w:r>
+      <w:r>
+        <w:t xml:space="preserve"> </w:t>
+      </w:r>
+      <w:r>
+        <w:rPr>
+          <w:b/>
+          <w:bCs/>
+        </w:rPr>
+        <w:t xml:space="preserve">Lock Screen</w:t>
+      </w:r>
+      <w:r>
+        <w:t xml:space="preserve">) instead. If the computer sleeps during a session anyway, Rosavin shows a notification after it wakes up that says why.</w:t>
       </w:r>
     </w:p>
     <w:p>
@@ -5274,7 +5449,7 @@
         <w:pStyle w:val="Compact"/>
         <w:numPr>
           <w:ilvl w:val="0"/>
-          <w:numId w:val="1011"/>
+          <w:numId w:val="1012"/>
         </w:numPr>
       </w:pPr>
       <w:r>
@@ -5350,7 +5525,7 @@
         <w:pStyle w:val="Compact"/>
         <w:numPr>
           <w:ilvl w:val="0"/>
-          <w:numId w:val="1011"/>
+          <w:numId w:val="1012"/>
         </w:numPr>
       </w:pPr>
       <w:r>
@@ -5967,6 +6142,9 @@
     <w:abstractNumId w:val="991"/>
   </w:num>
   <w:num w:numId="1011">
+    <w:abstractNumId w:val="991"/>
+  </w:num>
+  <w:num w:numId="1012">
     <w:abstractNumId w:val="991"/>
   </w:num>
 </w:numbering>

</xml_diff>